<commit_message>
disponibilizar prints no git
</commit_message>
<xml_diff>
--- a/_PRINTS/printscreens.docx
+++ b/_PRINTS/printscreens.docx
@@ -4,6 +4,7 @@
   <w:body>
     <w:p>
       <w:pPr>
+        <w:outlineLvl w:val="0"/>
         <w:rPr>
           <w:lang w:val="pt-PT"/>
         </w:rPr>
@@ -53,6 +54,7 @@
     </w:p>
     <w:p>
       <w:pPr>
+        <w:outlineLvl w:val="0"/>
         <w:rPr>
           <w:lang w:val="pt-PT"/>
         </w:rPr>
@@ -580,7 +582,7 @@
     <w:p>
       <w:r>
         <w:pict>
-          <v:shape id="_x0000_i1031" type="#_x0000_t75" style="width:424.9pt;height:270.55pt">
+          <v:shape id="_x0000_i1031" type="#_x0000_t75" style="width:424.9pt;height:269.45pt">
             <v:imagedata r:id="rId10" o:title="del_eliminarfilme"/>
           </v:shape>
         </w:pict>
@@ -784,6 +786,36 @@
     <w:uiPriority w:val="99"/>
     <w:semiHidden/>
     <w:unhideWhenUsed/>
+  </w:style>
+  <w:style w:type="paragraph" w:styleId="Mapadodocumento">
+    <w:name w:val="Document Map"/>
+    <w:basedOn w:val="Normal"/>
+    <w:link w:val="MapadodocumentoCarcter"/>
+    <w:uiPriority w:val="99"/>
+    <w:semiHidden/>
+    <w:unhideWhenUsed/>
+    <w:rsid w:val="00F63811"/>
+    <w:pPr>
+      <w:spacing w:after="0" w:line="240" w:lineRule="auto"/>
+    </w:pPr>
+    <w:rPr>
+      <w:rFonts w:ascii="Tahoma" w:hAnsi="Tahoma" w:cs="Tahoma"/>
+      <w:sz w:val="16"/>
+      <w:szCs w:val="16"/>
+    </w:rPr>
+  </w:style>
+  <w:style w:type="character" w:customStyle="1" w:styleId="MapadodocumentoCarcter">
+    <w:name w:val="Mapa do documento Carácter"/>
+    <w:basedOn w:val="Tipodeletrapredefinidodopargrafo"/>
+    <w:link w:val="Mapadodocumento"/>
+    <w:uiPriority w:val="99"/>
+    <w:semiHidden/>
+    <w:rsid w:val="00F63811"/>
+    <w:rPr>
+      <w:rFonts w:ascii="Tahoma" w:hAnsi="Tahoma" w:cs="Tahoma"/>
+      <w:sz w:val="16"/>
+      <w:szCs w:val="16"/>
+    </w:rPr>
   </w:style>
 </w:styles>
 </file>

</xml_diff>